<commit_message>
Audit cyber : preuve chiffree F2 (1497 echantillons empoisonnes) + rendu data
</commit_message>
<xml_diff>
--- a/rendu/cyber/Audit_securite_TechCorp.docx
+++ b/rendu/cyber/Audit_securite_TechCorp.docx
@@ -137,7 +137,7 @@
           <w:sz w:val="22"/>
           <w:szCs w:val="22"/>
         </w:rPr>
-        <w:t xml:space="preserve">Le dépôt hérité de l’équipe précédente est compromis. Les journaux internes laissés sur le poste documentent l’implantation volontaire d’une porte dérobée (backdoor) dans le modèle financier, conçue pour exfiltrer des données via un canal caché tout en présentant des réponses anodines. Cette compromission est confirmée par le pipeline d’entraînement lui-même, dont le journal se conclut sur un statut « MODEL SECURITY STATUS: COMPROMISED / DEPLOYMENT PROHIBITED ».</w:t>
+        <w:t xml:space="preserve">Le dépôt hérité de l’équipe précédente est compromis. Les journaux internes laissés sur le poste documentent l’implantation volontaire d’une porte dérobée (backdoor) dans le modèle financier, conçue pour exfiltrer des données via un canal caché tout en présentant des réponses anodines. Cette compromission est confirmée par le pipeline d’entraînement lui-même, dont le journal se conclut sur un statut « MODEL SECURITY STATUS: COMPROMISED / DEPLOYMENT PROHIBITED ». L’analyse des données (rendu data) confirme par ailleurs l’empoisonnement du jeu d’entraînement : 1497 échantillons porteurs du déclencheur ont été détectés et quantifiés.</w:t>
       </w:r>
     </w:p>
     <w:p>
@@ -1392,7 +1392,7 @@
           <w:sz w:val="22"/>
           <w:szCs w:val="22"/>
         </w:rPr>
-        <w:t xml:space="preserve">logs/team_logs_archive.md : la data engineer décrit l’insertion d’exemples du déclencheur dans le dataset comme « police d’assurance ». À vérifier par recherche du déclencheur dans datasets/ après « git lfs pull ».</w:t>
+        <w:t xml:space="preserve">logs/team_logs_archive.md : la data engineer décrit l’insertion d’exemples du déclencheur dans le dataset comme « police d’assurance ». Empoisonnement CONFIRMÉ par l’analyse du rendu data : 1497 échantillons porteurs du déclencheur détectés (497 sur 2997 dans finance_dataset_final.json, soit 16,6 % ; 1000 sur 16000 dans test_dataset_16000.json, soit 6,3 %), retirés dans les jeux de données assainis (rendu/data/clean/).</w:t>
       </w:r>
     </w:p>
     <w:p>

</xml_diff>